<commit_message>
Fix Muskuloskeletal Okupasi notes: restore missing 2.8a, 2.13b, 2.13c, 2.14b sections
</commit_message>
<xml_diff>
--- a/PPDS Okupasi Board Notes/MUSKULOSKELETAL OKUPASI.docx
+++ b/PPDS Okupasi Board Notes/MUSKULOSKELETAL OKUPASI.docx
@@ -6087,6 +6087,837 @@
       </w:r>
       <w:r>
         <w:t xml:space="preserve"> — adalah kunci kelulusan utama stase lisan. Kuasai rujukan ISO 11228-1 Lampiran A mengenai klasifikasi penyakit spinal berat agar jawaban tidak dapat dipatahkan penguji.</w:t>
+      </w:r>
+    </w:p>
+    <w:p>
+      <w:pPr>
+        <w:pStyle w:val="Heading1"/>
+      </w:pPr>
+      <w:r>
+        <w:t>2.8 Diagnosis Penunjang</w:t>
+      </w:r>
+    </w:p>
+    <w:p>
+      <w:pPr>
+        <w:pStyle w:val="Heading2"/>
+      </w:pPr>
+      <w:r>
+        <w:t>2.8a Diagnosis penunjang: EMG/NCS, USG, MRI, X-ray — indikasi [MEMADAI]</w:t>
+      </w:r>
+    </w:p>
+    <w:p>
+      <w:r>
+        <w:t xml:space="preserve">Pemeriksaan penunjang di kedokteran okupasi memiliki pilar ganda: </w:t>
+      </w:r>
+      <w:r>
+        <w:rPr>
+          <w:b/>
+        </w:rPr>
+        <w:t>Validasi Klinis</w:t>
+      </w:r>
+      <w:r>
+        <w:t xml:space="preserve"> (membuktikan keberadaan penyakit secara objektif untuk penanganan individu) dan </w:t>
+      </w:r>
+      <w:r>
+        <w:rPr>
+          <w:b/>
+        </w:rPr>
+        <w:t>Validasi Medikolegal</w:t>
+      </w:r>
+      <w:r>
+        <w:t xml:space="preserve"> (pembuktian kausalitas PAK berdasarkan Perpres No. 7 Tahun 2019). Banyak kandidat gugur karena melakukan </w:t>
+      </w:r>
+      <w:r>
+        <w:rPr>
+          <w:i/>
+        </w:rPr>
+        <w:t>over-investigation</w:t>
+      </w:r>
+      <w:r>
+        <w:t xml:space="preserve"> (mis. merujuk MRI lumbal pada semua kasus LBP non-spesifik) atau menggunakan alat penunjang sebagai skrining asimtomatik yang melanggar prinsip epidemiologi okupasi.</w:t>
+      </w:r>
+    </w:p>
+    <w:p>
+      <w:r>
+        <w:rPr>
+          <w:b/>
+        </w:rPr>
+        <w:t>Pilar I — Elektrodiagnostik (NCS &amp; Needle EMG):</w:t>
+      </w:r>
+      <w:r>
+        <w:t xml:space="preserve"> metode objektif utama mengevaluasi konduksi elektrik dan integritas fungsional serabut saraf perifer + unit motorik otot.</w:t>
+      </w:r>
+    </w:p>
+    <w:p>
+      <w:pPr>
+        <w:pStyle w:val="ListBullet"/>
+      </w:pPr>
+      <w:r>
+        <w:rPr>
+          <w:b/>
+        </w:rPr>
+        <w:t>CTS</w:t>
+      </w:r>
+      <w:r>
+        <w:t xml:space="preserve">: konfirmasi definitif pada gejala sensorik dermatomal medianus fokal + uji provokasi sugestif. NCS membuktikan hambatan hantar saraf melintasi pergelangan tangan (DML &gt;4.2 ms atau selisih latensi sensorik transkarpal &gt;0.8 ms). Needle EMG pada kasus sedang-berat untuk menilai denervasi aktif APB, persiapan bedah dekompresi. </w:t>
+      </w:r>
+      <w:r>
+        <w:rPr>
+          <w:b/>
+        </w:rPr>
+        <w:t>Pitfall ujian</w:t>
+      </w:r>
+      <w:r>
+        <w:t>: dilarang keras memakai NCS sebagai alat skrining tunggal pekerja asimtomatik.</w:t>
+      </w:r>
+    </w:p>
+    <w:p>
+      <w:pPr>
+        <w:pStyle w:val="ListBullet"/>
+      </w:pPr>
+      <w:r>
+        <w:rPr>
+          <w:b/>
+        </w:rPr>
+        <w:t>LRS</w:t>
+      </w:r>
+      <w:r>
+        <w:t xml:space="preserve">: diindikasikan bila dicurigai keterlibatan radiks (radikulopati aktif, nyeri menjalar melewati lutut) untuk membedakan dari LBP non-spesifik. Needle EMG paraspinal lumbal + otot ekstremitas bawah (miotom L4/L5/S1) membuktikan kehilangan akson motorik fokal &amp; kronisitas cedera. </w:t>
+      </w:r>
+      <w:r>
+        <w:rPr>
+          <w:b/>
+        </w:rPr>
+        <w:t>Tidak perlu</w:t>
+      </w:r>
+      <w:r>
+        <w:t>: Non-specific LBP tanpa gejala radikuler/defisit motorik fokal.</w:t>
+      </w:r>
+    </w:p>
+    <w:p>
+      <w:pPr>
+        <w:pStyle w:val="ListBullet"/>
+      </w:pPr>
+      <w:r>
+        <w:rPr>
+          <w:b/>
+        </w:rPr>
+        <w:t>SAPS, Epicondylitis, OA</w:t>
+      </w:r>
+      <w:r>
+        <w:t xml:space="preserve">: umumnya </w:t>
+      </w:r>
+      <w:r>
+        <w:rPr>
+          <w:b/>
+        </w:rPr>
+        <w:t>Not Recommended</w:t>
+      </w:r>
+      <w:r>
+        <w:t>, kecuali mengeklusi DD neuropati jebakan regional (mis. Cervical Radiculopathy pada nyeri bahu, Radial/Ulnar Tunnel Syndrome pada nyeri siku).</w:t>
+      </w:r>
+    </w:p>
+    <w:p>
+      <w:r>
+        <w:rPr>
+          <w:b/>
+        </w:rPr>
+        <w:t>Pilar II — USG Muskuloskeletal (MSK USG):</w:t>
+      </w:r>
+    </w:p>
+    <w:p>
+      <w:pPr>
+        <w:pStyle w:val="ListBullet"/>
+      </w:pPr>
+      <w:r>
+        <w:rPr>
+          <w:b/>
+        </w:rPr>
+        <w:t>SAPS/Rotator Cuff Tendonitis</w:t>
+      </w:r>
+      <w:r>
+        <w:t>: pilihan elektif utama (preferred modality) — evaluasi real-time dinamis tendon rotator cuff (M. Supraspinatus) &amp; bursa subakromial; deteksi tendinitis (penebalan/hipoekoisitas), bursitis (efusi), kalsifikasi tendon, bedakan robekan parsial vs total.</w:t>
+      </w:r>
+    </w:p>
+    <w:p>
+      <w:pPr>
+        <w:pStyle w:val="ListBullet"/>
+      </w:pPr>
+      <w:r>
+        <w:rPr>
+          <w:b/>
+        </w:rPr>
+        <w:t>CTS</w:t>
+      </w:r>
+      <w:r>
+        <w:t xml:space="preserve">: diagnostik komplementer objektif cepat — ukur Cross-Sectional Area (CSA) N. Medianus di pintu masuk terowongan karpal. </w:t>
+      </w:r>
+      <w:r>
+        <w:rPr>
+          <w:b/>
+        </w:rPr>
+        <w:t>CSA &gt;8.5-10 mm²</w:t>
+      </w:r>
+      <w:r>
+        <w:t xml:space="preserve"> spesifisitas tinggi untuk pembengkakan saraf akibat kompresi kronis.</w:t>
+      </w:r>
+    </w:p>
+    <w:p>
+      <w:pPr>
+        <w:pStyle w:val="ListBullet"/>
+      </w:pPr>
+      <w:r>
+        <w:rPr>
+          <w:b/>
+        </w:rPr>
+        <w:t>Epicondylitis</w:t>
+      </w:r>
+      <w:r>
+        <w:t xml:space="preserve">: diindikasikan pada kasus kronis refrakter terhadap terapi konservatif &gt;6 minggu. </w:t>
+      </w:r>
+      <w:r>
+        <w:rPr>
+          <w:b/>
+        </w:rPr>
+        <w:t>Tidak perlu</w:t>
+      </w:r>
+      <w:r>
+        <w:t xml:space="preserve"> pada evaluasi awal — diagnosis klinis murni via anamnesis lokasi nyeri + reproduksi nyeri saat resisted wrist extension (lateral)/flexion (medial).</w:t>
+      </w:r>
+    </w:p>
+    <w:p>
+      <w:pPr>
+        <w:pStyle w:val="ListBullet"/>
+      </w:pPr>
+      <w:r>
+        <w:rPr>
+          <w:b/>
+        </w:rPr>
+        <w:t>LRS</w:t>
+      </w:r>
+      <w:r>
+        <w:t xml:space="preserve">: </w:t>
+      </w:r>
+      <w:r>
+        <w:rPr>
+          <w:b/>
+        </w:rPr>
+        <w:t>Kontraindikasi/tidak dapat digunakan</w:t>
+      </w:r>
+      <w:r>
+        <w:t xml:space="preserve"> — gelombang USG tidak menembus tulang vertebra lumbal.</w:t>
+      </w:r>
+    </w:p>
+    <w:p>
+      <w:pPr>
+        <w:pStyle w:val="ListBullet"/>
+      </w:pPr>
+      <w:r>
+        <w:rPr>
+          <w:b/>
+        </w:rPr>
+        <w:t>OA</w:t>
+      </w:r>
+      <w:r>
+        <w:t>: tidak rutin, kecuali memandu tindakan aspirasi efusi sendi atau injeksi steroid intraartikular terarah (USG-guided injection).</w:t>
+      </w:r>
+    </w:p>
+    <w:p>
+      <w:r>
+        <w:rPr>
+          <w:b/>
+        </w:rPr>
+        <w:t>Pilar III — MRI:</w:t>
+      </w:r>
+      <w:r>
+        <w:t xml:space="preserve"> resolusi kontras jaringan lunak tertinggi — unggul untuk diskus intervertebralis, kompresi radiks di kanalis spinalis, robekan tendon kompleks.</w:t>
+      </w:r>
+    </w:p>
+    <w:p>
+      <w:pPr>
+        <w:pStyle w:val="ListBullet"/>
+      </w:pPr>
+      <w:r>
+        <w:rPr>
+          <w:b/>
+        </w:rPr>
+        <w:t>LRS/HNP</w:t>
+      </w:r>
+      <w:r>
+        <w:t xml:space="preserve">: indikasi kuat mengonfirmasi herniasi diskus (protrusion/extrusion/sequestration), stenosis kanal, atau terdapat defisit neurologis motorik progresif (MRC &lt;4, foot drop) untuk persiapan operasi dekompresi darurat. </w:t>
+      </w:r>
+      <w:r>
+        <w:rPr>
+          <w:b/>
+        </w:rPr>
+        <w:t>Pitfall ujian</w:t>
+      </w:r>
+      <w:r>
+        <w:t>: sangat tidak direkomendasikan pada Non-specific LBP tanpa gejala radikuler — studi longitudinal membuktikan korelasi sangat lemah antara temuan degenerasi diskus MRI dengan keparahan nyeri; MRI tanpa indikasi radikulopati fokal hanya memicu kecemasan iatrogenik dan over-treatment.</w:t>
+      </w:r>
+    </w:p>
+    <w:p>
+      <w:pPr>
+        <w:pStyle w:val="ListBullet"/>
+      </w:pPr>
+      <w:r>
+        <w:rPr>
+          <w:b/>
+        </w:rPr>
+        <w:t>SAPS</w:t>
+      </w:r>
+      <w:r>
+        <w:t>: diindikasikan bila dicurigai robekan rotator cuff masif (kelemahan abduksi nyata MRC ≤3 atau Drop Arm Test positif) — mengukur derajat retraksi tendon ke glenoid rim untuk memandu keputusan bedah rekonstruksi.</w:t>
+      </w:r>
+    </w:p>
+    <w:p>
+      <w:pPr>
+        <w:pStyle w:val="ListBullet"/>
+      </w:pPr>
+      <w:r>
+        <w:rPr>
+          <w:b/>
+        </w:rPr>
+        <w:t>CTS, Epicondylitis, OA</w:t>
+      </w:r>
+      <w:r>
+        <w:t>: umumnya tidak direkomendasikan, kecuali kasus refrakter kompleks (epicondylitis) atau deteksi dini kerusakan kartilago pra-rontgen pada penelitian khusus (OA).</w:t>
+      </w:r>
+    </w:p>
+    <w:p>
+      <w:r>
+        <w:rPr>
+          <w:b/>
+        </w:rPr>
+        <w:t>Pilar IV — Foto Polos/Radiografi (X-Ray):</w:t>
+      </w:r>
+      <w:r>
+        <w:t xml:space="preserve"> lini pertama cepat-murah-efektif untuk struktur tulang (osseus), celah sendi, kalsifikasi fokal, osteofit.</w:t>
+      </w:r>
+    </w:p>
+    <w:p>
+      <w:pPr>
+        <w:pStyle w:val="ListBullet"/>
+      </w:pPr>
+      <w:r>
+        <w:rPr>
+          <w:b/>
+        </w:rPr>
+        <w:t>OA Genu/Hip</w:t>
+      </w:r>
+      <w:r>
+        <w:t>: pemeriksaan wajib (gold standard) untuk diagnosis definitif + derajat keparahan — wajib posisi berdiri menumpu beban (weight-bearing) untuk menilai penyempitan celah sendi akurat; grading via Kellgren-Lawrence (KL ≥2 = OA definitif).</w:t>
+      </w:r>
+    </w:p>
+    <w:p>
+      <w:pPr>
+        <w:pStyle w:val="ListBullet"/>
+      </w:pPr>
+      <w:r>
+        <w:rPr>
+          <w:b/>
+        </w:rPr>
+        <w:t>SAPS</w:t>
+      </w:r>
+      <w:r>
+        <w:t>: berguna mendeteksi deposit kalsifikasi fokal masif pada tendon (calcific tendinitis), bony spurs akromion, AC joint OA.</w:t>
+      </w:r>
+    </w:p>
+    <w:p>
+      <w:pPr>
+        <w:pStyle w:val="ListBullet"/>
+      </w:pPr>
+      <w:r>
+        <w:rPr>
+          <w:b/>
+        </w:rPr>
+        <w:t>LRS</w:t>
+      </w:r>
+      <w:r>
+        <w:t>: tidak direkomendasikan untuk LBP non-spesifik (korelasi buruk gejala vs perubahan degeneratif rontgen); hanya diindikasikan bila curiga fraktur kompresi vertebra (trauma/osteoporosis/steroid), spondilolistesis, atau infeksi tulang belakang setelah saringan red flags positif ([[muskuloskeletal_okupasi 2.7c]]).</w:t>
+      </w:r>
+    </w:p>
+    <w:p>
+      <w:pPr>
+        <w:pStyle w:val="ListBullet"/>
+      </w:pPr>
+      <w:r>
+        <w:rPr>
+          <w:b/>
+        </w:rPr>
+        <w:t>CTS &amp; Epicondylitis</w:t>
+      </w:r>
+      <w:r>
+        <w:t>: tidak diindikasikan — patologi murni jaringan lunak (tendon/saraf perifer) tidak tervisualisasi pada rontgen biasa.</w:t>
+      </w:r>
+    </w:p>
+    <w:p>
+      <w:r>
+        <w:rPr>
+          <w:b/>
+        </w:rPr>
+        <w:t>Matriks Ringkas Panduan Board:</w:t>
+      </w:r>
+    </w:p>
+    <w:tbl>
+      <w:tblPr>
+        <w:tblStyle w:val="TableGrid"/>
+        <w:tblW w:type="auto" w:w="0"/>
+        <w:tblLayout w:type="autofit"/>
+        <w:tblLook w:firstColumn="1" w:firstRow="1" w:lastColumn="0" w:lastRow="0" w:noHBand="0" w:noVBand="1" w:val="04A0"/>
+      </w:tblPr>
+      <w:tblGrid>
+        <w:gridCol w:w="1728"/>
+        <w:gridCol w:w="1728"/>
+        <w:gridCol w:w="1728"/>
+        <w:gridCol w:w="1728"/>
+        <w:gridCol w:w="1728"/>
+      </w:tblGrid>
+      <w:tr>
+        <w:tc>
+          <w:tcPr>
+            <w:tcW w:type="dxa" w:w="1728"/>
+            <w:shd w:val="clear" w:color="auto" w:fill="1F4E5F"/>
+          </w:tcPr>
+          <w:p>
+            <w:r>
+              <w:rPr>
+                <w:b/>
+                <w:color w:val="FFFFFF"/>
+                <w:sz w:val="18"/>
+              </w:rPr>
+              <w:t>Kondisi</w:t>
+            </w:r>
+          </w:p>
+        </w:tc>
+        <w:tc>
+          <w:tcPr>
+            <w:tcW w:type="dxa" w:w="1728"/>
+            <w:shd w:val="clear" w:color="auto" w:fill="1F4E5F"/>
+          </w:tcPr>
+          <w:p>
+            <w:r>
+              <w:rPr>
+                <w:b/>
+                <w:color w:val="FFFFFF"/>
+                <w:sz w:val="18"/>
+              </w:rPr>
+              <w:t>EMG/NCS</w:t>
+            </w:r>
+          </w:p>
+        </w:tc>
+        <w:tc>
+          <w:tcPr>
+            <w:tcW w:type="dxa" w:w="1728"/>
+            <w:shd w:val="clear" w:color="auto" w:fill="1F4E5F"/>
+          </w:tcPr>
+          <w:p>
+            <w:r>
+              <w:rPr>
+                <w:b/>
+                <w:color w:val="FFFFFF"/>
+                <w:sz w:val="18"/>
+              </w:rPr>
+              <w:t>MSK USG</w:t>
+            </w:r>
+          </w:p>
+        </w:tc>
+        <w:tc>
+          <w:tcPr>
+            <w:tcW w:type="dxa" w:w="1728"/>
+            <w:shd w:val="clear" w:color="auto" w:fill="1F4E5F"/>
+          </w:tcPr>
+          <w:p>
+            <w:r>
+              <w:rPr>
+                <w:b/>
+                <w:color w:val="FFFFFF"/>
+                <w:sz w:val="18"/>
+              </w:rPr>
+              <w:t>MRI</w:t>
+            </w:r>
+          </w:p>
+        </w:tc>
+        <w:tc>
+          <w:tcPr>
+            <w:tcW w:type="dxa" w:w="1728"/>
+            <w:shd w:val="clear" w:color="auto" w:fill="1F4E5F"/>
+          </w:tcPr>
+          <w:p>
+            <w:r>
+              <w:rPr>
+                <w:b/>
+                <w:color w:val="FFFFFF"/>
+                <w:sz w:val="18"/>
+              </w:rPr>
+              <w:t>X-Ray</w:t>
+            </w:r>
+          </w:p>
+        </w:tc>
+      </w:tr>
+      <w:tr>
+        <w:tc>
+          <w:tcPr>
+            <w:tcW w:type="dxa" w:w="1728"/>
+          </w:tcPr>
+          <w:p>
+            <w:r>
+              <w:rPr>
+                <w:sz w:val="18"/>
+              </w:rPr>
+              <w:t>CTS</w:t>
+            </w:r>
+          </w:p>
+        </w:tc>
+        <w:tc>
+          <w:tcPr>
+            <w:tcW w:type="dxa" w:w="1728"/>
+          </w:tcPr>
+          <w:p>
+            <w:r>
+              <w:rPr>
+                <w:sz w:val="18"/>
+              </w:rPr>
+              <w:t>Gold standard konfirmasi</w:t>
+            </w:r>
+          </w:p>
+        </w:tc>
+        <w:tc>
+          <w:tcPr>
+            <w:tcW w:type="dxa" w:w="1728"/>
+          </w:tcPr>
+          <w:p>
+            <w:r>
+              <w:rPr>
+                <w:sz w:val="18"/>
+              </w:rPr>
+              <w:t>Komplementer (CSA &gt;8.5-10mm²)</w:t>
+            </w:r>
+          </w:p>
+        </w:tc>
+        <w:tc>
+          <w:tcPr>
+            <w:tcW w:type="dxa" w:w="1728"/>
+          </w:tcPr>
+          <w:p>
+            <w:r>
+              <w:rPr>
+                <w:sz w:val="18"/>
+              </w:rPr>
+              <w:t>Not Recommended</w:t>
+            </w:r>
+          </w:p>
+        </w:tc>
+        <w:tc>
+          <w:tcPr>
+            <w:tcW w:type="dxa" w:w="1728"/>
+          </w:tcPr>
+          <w:p>
+            <w:r>
+              <w:rPr>
+                <w:sz w:val="18"/>
+              </w:rPr>
+              <w:t>Not Recommended</w:t>
+            </w:r>
+          </w:p>
+        </w:tc>
+      </w:tr>
+      <w:tr>
+        <w:tc>
+          <w:tcPr>
+            <w:tcW w:type="dxa" w:w="1728"/>
+          </w:tcPr>
+          <w:p>
+            <w:r>
+              <w:rPr>
+                <w:sz w:val="18"/>
+              </w:rPr>
+              <w:t>LRS</w:t>
+            </w:r>
+          </w:p>
+        </w:tc>
+        <w:tc>
+          <w:tcPr>
+            <w:tcW w:type="dxa" w:w="1728"/>
+          </w:tcPr>
+          <w:p>
+            <w:r>
+              <w:rPr>
+                <w:sz w:val="18"/>
+              </w:rPr>
+              <w:t>Berguna (radikulopati aktif &amp; akson loss)</w:t>
+            </w:r>
+          </w:p>
+        </w:tc>
+        <w:tc>
+          <w:tcPr>
+            <w:tcW w:type="dxa" w:w="1728"/>
+          </w:tcPr>
+          <w:p>
+            <w:r>
+              <w:rPr>
+                <w:sz w:val="18"/>
+              </w:rPr>
+              <w:t>Kontraindikasi (tak tembus tulang)</w:t>
+            </w:r>
+          </w:p>
+        </w:tc>
+        <w:tc>
+          <w:tcPr>
+            <w:tcW w:type="dxa" w:w="1728"/>
+          </w:tcPr>
+          <w:p>
+            <w:r>
+              <w:rPr>
+                <w:sz w:val="18"/>
+              </w:rPr>
+              <w:t>Pilihan utama (radikuler, defisit motorik, red flags)</w:t>
+            </w:r>
+          </w:p>
+        </w:tc>
+        <w:tc>
+          <w:tcPr>
+            <w:tcW w:type="dxa" w:w="1728"/>
+          </w:tcPr>
+          <w:p>
+            <w:r>
+              <w:rPr>
+                <w:sz w:val="18"/>
+              </w:rPr>
+              <w:t>Tidak rutin (hanya curiga fraktur/spondilolistesis/red flags)</w:t>
+            </w:r>
+          </w:p>
+        </w:tc>
+      </w:tr>
+      <w:tr>
+        <w:tc>
+          <w:tcPr>
+            <w:tcW w:type="dxa" w:w="1728"/>
+          </w:tcPr>
+          <w:p>
+            <w:r>
+              <w:rPr>
+                <w:sz w:val="18"/>
+              </w:rPr>
+              <w:t>SAPS</w:t>
+            </w:r>
+          </w:p>
+        </w:tc>
+        <w:tc>
+          <w:tcPr>
+            <w:tcW w:type="dxa" w:w="1728"/>
+          </w:tcPr>
+          <w:p>
+            <w:r>
+              <w:rPr>
+                <w:sz w:val="18"/>
+              </w:rPr>
+              <w:t>Tidak rutin (kecuali DD radikulopati servikal)</w:t>
+            </w:r>
+          </w:p>
+        </w:tc>
+        <w:tc>
+          <w:tcPr>
+            <w:tcW w:type="dxa" w:w="1728"/>
+          </w:tcPr>
+          <w:p>
+            <w:r>
+              <w:rPr>
+                <w:sz w:val="18"/>
+              </w:rPr>
+              <w:t>Preferred modality (tendon &amp; bursa dinamis)</w:t>
+            </w:r>
+          </w:p>
+        </w:tc>
+        <w:tc>
+          <w:tcPr>
+            <w:tcW w:type="dxa" w:w="1728"/>
+          </w:tcPr>
+          <w:p>
+            <w:r>
+              <w:rPr>
+                <w:sz w:val="18"/>
+              </w:rPr>
+              <w:t>Indikasi kuat (curiga robek masif/rencana bedah)</w:t>
+            </w:r>
+          </w:p>
+        </w:tc>
+        <w:tc>
+          <w:tcPr>
+            <w:tcW w:type="dxa" w:w="1728"/>
+          </w:tcPr>
+          <w:p>
+            <w:r>
+              <w:rPr>
+                <w:sz w:val="18"/>
+              </w:rPr>
+              <w:t>Berguna (bony spurs, calcific tendinitis, AC joint OA)</w:t>
+            </w:r>
+          </w:p>
+        </w:tc>
+      </w:tr>
+      <w:tr>
+        <w:tc>
+          <w:tcPr>
+            <w:tcW w:type="dxa" w:w="1728"/>
+          </w:tcPr>
+          <w:p>
+            <w:r>
+              <w:rPr>
+                <w:sz w:val="18"/>
+              </w:rPr>
+              <w:t>Epicondylitis</w:t>
+            </w:r>
+          </w:p>
+        </w:tc>
+        <w:tc>
+          <w:tcPr>
+            <w:tcW w:type="dxa" w:w="1728"/>
+          </w:tcPr>
+          <w:p>
+            <w:r>
+              <w:rPr>
+                <w:sz w:val="18"/>
+              </w:rPr>
+              <w:t>Tidak rutin (kecuali curiga jepitan n. radialis/ulnaris)</w:t>
+            </w:r>
+          </w:p>
+        </w:tc>
+        <w:tc>
+          <w:tcPr>
+            <w:tcW w:type="dxa" w:w="1728"/>
+          </w:tcPr>
+          <w:p>
+            <w:r>
+              <w:rPr>
+                <w:sz w:val="18"/>
+              </w:rPr>
+              <w:t>Berguna (kasus kronis refrakter)</w:t>
+            </w:r>
+          </w:p>
+        </w:tc>
+        <w:tc>
+          <w:tcPr>
+            <w:tcW w:type="dxa" w:w="1728"/>
+          </w:tcPr>
+          <w:p>
+            <w:r>
+              <w:rPr>
+                <w:sz w:val="18"/>
+              </w:rPr>
+              <w:t>Not Recommended (kecuali refrakter kompleks)</w:t>
+            </w:r>
+          </w:p>
+        </w:tc>
+        <w:tc>
+          <w:tcPr>
+            <w:tcW w:type="dxa" w:w="1728"/>
+          </w:tcPr>
+          <w:p>
+            <w:r>
+              <w:rPr>
+                <w:sz w:val="18"/>
+              </w:rPr>
+              <w:t>Not Recommended</w:t>
+            </w:r>
+          </w:p>
+        </w:tc>
+      </w:tr>
+      <w:tr>
+        <w:tc>
+          <w:tcPr>
+            <w:tcW w:type="dxa" w:w="1728"/>
+          </w:tcPr>
+          <w:p>
+            <w:r>
+              <w:rPr>
+                <w:sz w:val="18"/>
+              </w:rPr>
+              <w:t>OA Genu/Hip</w:t>
+            </w:r>
+          </w:p>
+        </w:tc>
+        <w:tc>
+          <w:tcPr>
+            <w:tcW w:type="dxa" w:w="1728"/>
+          </w:tcPr>
+          <w:p>
+            <w:r>
+              <w:rPr>
+                <w:sz w:val="18"/>
+              </w:rPr>
+              <w:t>Tidak diperlukan</w:t>
+            </w:r>
+          </w:p>
+        </w:tc>
+        <w:tc>
+          <w:tcPr>
+            <w:tcW w:type="dxa" w:w="1728"/>
+          </w:tcPr>
+          <w:p>
+            <w:r>
+              <w:rPr>
+                <w:sz w:val="18"/>
+              </w:rPr>
+              <w:t>Tidak rutin (memandu aspirasi/injeksi)</w:t>
+            </w:r>
+          </w:p>
+        </w:tc>
+        <w:tc>
+          <w:tcPr>
+            <w:tcW w:type="dxa" w:w="1728"/>
+          </w:tcPr>
+          <w:p>
+            <w:r>
+              <w:rPr>
+                <w:sz w:val="18"/>
+              </w:rPr>
+              <w:t>Not Recommended (kecuali deteksi dini kartilago)</w:t>
+            </w:r>
+          </w:p>
+        </w:tc>
+        <w:tc>
+          <w:tcPr>
+            <w:tcW w:type="dxa" w:w="1728"/>
+          </w:tcPr>
+          <w:p>
+            <w:r>
+              <w:rPr>
+                <w:sz w:val="18"/>
+              </w:rPr>
+              <w:t>Gold standard (weight-bearing, KL grading)</w:t>
+            </w:r>
+          </w:p>
+        </w:tc>
+      </w:tr>
+    </w:tbl>
+    <w:p/>
+    <w:p>
+      <w:r>
+        <w:rPr>
+          <w:b/>
+        </w:rPr>
+        <w:t>Lafaz OSCE (Rencana Investigasi Penunjang CTS):</w:t>
+      </w:r>
+      <w:r>
+        <w:t xml:space="preserve"> </w:t>
+      </w:r>
+      <w:r>
+        <w:rPr>
+          <w:i/>
+        </w:rPr>
+        <w:t>"Bapak/Ibu Penguji, berdasarkan hasil pemeriksaan fisik di mana pasien menunjukkan gejala klinis sensorik medianus bilateral dengan Phalen's test positif, saya menetapkan diagnosis kerja sebagai Suspek Carpal Tunnel Syndrome Bilateral. Rencana investigasi penunjang awal yang saya lakukan adalah merujuk pasien untuk menjalani Studi Hantar Saraf (NCS) dan Needle EMG ekstremitas atas bilateral. Langkah ini wajib dilakukan untuk mengonfirmasi diagnosis secara objektif dengan mengukur adanya perpanjangan latensi motorik distal medianus melebihi 4.2 milidetik, sekaligus mendeteksi adanya denervasi aktif pada otot thenar guna menentukan arah terapi medis selanjutnya. Saya juga merencanakan pemeriksaan USG Muskuloskeletal pergelangan tangan untuk menilai adanya pembengkakan saraf medianus secara fokal dengan mengukur luas penampang saraf (CSA) yang bernilai lebih dari 10 mm². Selaku calon spesialis Sp.Ok, saya menegaskan bahwa hasil pemeriksaan NCS abnormal ini nantinya hanya akan saya gunakan untuk konfirmasi kasus simtomatik klinis, dan tidak akan pernah saya gunakan sebagai alat skrining tunggal penentu kelayakan penempatan kerja pekerja asimtomatik karena melanggar prinsip epidemiologi okupasi."</w:t>
+      </w:r>
+    </w:p>
+    <w:p>
+      <w:r>
+        <w:rPr>
+          <w:b/>
+        </w:rPr>
+        <w:t>Pesan Akhir Dewan Penguji Board:</w:t>
+      </w:r>
+      <w:r>
+        <w:t xml:space="preserve"> kemampuan menjelaskan alasan logis di balik pemilihan modalitas penunjang — terutama pemahaman tajam mengenai kontraindikasi NCS asimtomatik dan pentingnya rontgen weight-bearing pada OA — membuktikan kompetensi klinis matang, evidence-based, dan efisien dalam manajemen biaya kesehatan industri.</w:t>
       </w:r>
     </w:p>
     <w:p>
@@ -10246,6 +11077,425 @@
     </w:p>
     <w:p>
       <w:pPr>
+        <w:pStyle w:val="Heading2"/>
+      </w:pPr>
+      <w:r>
+        <w:t>2.13b Tatalaksana okupasi/komunitas: ergonomi, hirarki pengendalian, rotasi kerja [MEMADAI]</w:t>
+      </w:r>
+    </w:p>
+    <w:p>
+      <w:r>
+        <w:t>Mengobati pekerja secara klinis (level individu) tanpa intervensi lingkungan kerja (level komunitas) adalah bentuk kegagalan fatal (likely to fail). Sesuai amanat PP No. 50 Tahun 2012 tentang Penerapan SMK3 dan Permenaker No. 5 Tahun 2018 Pasal 23. Prinsip modifikasi JSA fokus ergonomi wajib memenuhi 2 kriteria: (1) tidak boleh mengurangi standar produksi, (2) tidak boleh menambah tenaga/beban fisik pekerja.</w:t>
+      </w:r>
+    </w:p>
+    <w:p>
+      <w:r>
+        <w:rPr>
+          <w:b/>
+        </w:rPr>
+        <w:t>I. Hirarki Pengendalian Ergonomi K3</w:t>
+      </w:r>
+      <w:r>
+        <w:t xml:space="preserve"> (diterapkan berurutan dari keandalan tertinggi):</w:t>
+      </w:r>
+    </w:p>
+    <w:p>
+      <w:pPr>
+        <w:pStyle w:val="ListNumber"/>
+      </w:pPr>
+      <w:r>
+        <w:rPr>
+          <w:b/>
+        </w:rPr>
+        <w:t>Eliminasi</w:t>
+      </w:r>
+      <w:r>
+        <w:t>: menghilangkan sumber bahaya ergonomis secara mutlak. Contoh (LRS/HNP manual handling): eliminasi pengangkatan manual barang berat (karung 50kg) dengan sistem pemindahan mekanis penuh — crane, vacuum lifter, robot manipulator.</w:t>
+      </w:r>
+    </w:p>
+    <w:p>
+      <w:pPr>
+        <w:pStyle w:val="ListNumber"/>
+      </w:pPr>
+      <w:r>
+        <w:rPr>
+          <w:b/>
+        </w:rPr>
+        <w:t>Substitusi</w:t>
+      </w:r>
+      <w:r>
+        <w:t>: mengganti alat/bahan/proses berbahaya dengan alternatif lebih aman. Contoh (CTS &amp; Epicondylitis): ganti obeng manual (pronasi-supinasi repetitif bertenaga) dengan obeng elektrik/pneumatik bertorsi otomatis.</w:t>
+      </w:r>
+    </w:p>
+    <w:p>
+      <w:pPr>
+        <w:pStyle w:val="ListNumber"/>
+      </w:pPr>
+      <w:r>
+        <w:rPr>
+          <w:b/>
+        </w:rPr>
+        <w:t>Engineering/Redesain Ergonomi</w:t>
+      </w:r>
+      <w:r>
+        <w:t>: mendesain ulang stasiun kerja, objek kerja, dan peralatan agar sesuai antropometri pekerja, meminimalkan postur janggal &amp; pengerahan gaya:</w:t>
+      </w:r>
+    </w:p>
+    <w:p>
+      <w:pPr>
+        <w:pStyle w:val="ListBullet2"/>
+      </w:pPr>
+      <w:r>
+        <w:rPr>
+          <w:b/>
+        </w:rPr>
+        <w:t>CTS &amp; Epicondylitis</w:t>
+      </w:r>
+      <w:r>
+        <w:t>: redesain tinggi meja kerja sesuai elbow height duduk/berdiri; sediakan keyboard tray dapat diatur + wrist rest untuk eliminasi contact stress; modifikasi geometri alat genggam (ergonomically shaped tools) mencegah deviasi ulnar &amp; fleksi ekstrem.</w:t>
+      </w:r>
+    </w:p>
+    <w:p>
+      <w:pPr>
+        <w:pStyle w:val="ListBullet2"/>
+      </w:pPr>
+      <w:r>
+        <w:rPr>
+          <w:b/>
+        </w:rPr>
+        <w:t>LRS/HNP</w:t>
+      </w:r>
+      <w:r>
+        <w:t>: rujuk prinsip RNLE — dekatkan objek ke tubuh (kurangi horizontal multiplier); sediakan meja/palet hidrolik menghindari angkat di bawah lutut/atas bahu; kursi kerja dengan adjustable lumbar support.</w:t>
+      </w:r>
+    </w:p>
+    <w:p>
+      <w:pPr>
+        <w:pStyle w:val="ListBullet2"/>
+      </w:pPr>
+      <w:r>
+        <w:rPr>
+          <w:b/>
+        </w:rPr>
+        <w:t>SAPS</w:t>
+      </w:r>
+      <w:r>
+        <w:t>: redesain tata letak kompartemen bahan dalam jangkauan optimal (turunkan rak atas) eliminasi overhead work; gunakan spring counter-balance/tool balancer menahan berat alat genggam.</w:t>
+      </w:r>
+    </w:p>
+    <w:p>
+      <w:pPr>
+        <w:pStyle w:val="ListBullet2"/>
+      </w:pPr>
+      <w:r>
+        <w:rPr>
+          <w:b/>
+        </w:rPr>
+        <w:t>OA Genu/Hip</w:t>
+      </w:r>
+      <w:r>
+        <w:t>: sediakan standing stool/sit-stand chair untuk redistribusi beban statis lutut; anti-fatigue matting untuk meredam beban lantai keras.</w:t>
+      </w:r>
+    </w:p>
+    <w:p>
+      <w:r>
+        <w:rPr>
+          <w:b/>
+        </w:rPr>
+        <w:t>II. Pengendalian Administratif (Modifikasi Organisasi Kerja):</w:t>
+      </w:r>
+    </w:p>
+    <w:p>
+      <w:pPr>
+        <w:pStyle w:val="ListNumber"/>
+      </w:pPr>
+      <w:r>
+        <w:rPr>
+          <w:b/>
+        </w:rPr>
+        <w:t>Rotasi Kerja (Work Rotation)</w:t>
+      </w:r>
+      <w:r>
+        <w:t>: pindahkan pekerja terencana antar stasiun kerja dengan beban biomekanis berbeda. Formulasi ISO/TR 12295/OCRA: untuk multitask dalam 1 shift, rotasi ideal per jam — menurunkan Worker Exposure Index &amp; meminimalkan akumulasi kelelahan otot fokal. Contoh: kasir bergantian peran tiap 1 jam dengan packer.</w:t>
+      </w:r>
+    </w:p>
+    <w:p>
+      <w:pPr>
+        <w:pStyle w:val="ListNumber"/>
+      </w:pPr>
+      <w:r>
+        <w:rPr>
+          <w:b/>
+        </w:rPr>
+        <w:t>Pelebaran Tugas (Work Expansion/Enlargement)</w:t>
+      </w:r>
+      <w:r>
+        <w:t>: integrasikan beberapa tugas bervariasi (mis. selingi tugas repetitif dengan quality check visual &amp; pelabelan) — memperpanjang cycle time &gt;30 detik, menurunkan frekuensi gerakan repetitif di bawah ambang bahaya.</w:t>
+      </w:r>
+    </w:p>
+    <w:p>
+      <w:pPr>
+        <w:pStyle w:val="ListNumber"/>
+      </w:pPr>
+      <w:r>
+        <w:rPr>
+          <w:b/>
+        </w:rPr>
+        <w:t>Motion Economy (Barnes 1963/1968)</w:t>
+      </w:r>
+      <w:r>
+        <w:t>:</w:t>
+      </w:r>
+    </w:p>
+    <w:p>
+      <w:pPr>
+        <w:pStyle w:val="ListBullet2"/>
+      </w:pPr>
+      <w:r>
+        <w:t>Alternating hands — gunakan tangan kanan-kiri bergantian agar satu sisi ekstremitas mendapat waktu pemulihan.</w:t>
+      </w:r>
+    </w:p>
+    <w:p>
+      <w:pPr>
+        <w:pStyle w:val="ListBullet2"/>
+      </w:pPr>
+      <w:r>
+        <w:t>Symmetrical counter-movements — arah stretching didesain berlawanan dengan postur janggal dominan.</w:t>
+      </w:r>
+    </w:p>
+    <w:p>
+      <w:pPr>
+        <w:pStyle w:val="ListBullet2"/>
+      </w:pPr>
+      <w:r>
+        <w:t>Gaya terkecil, hindari gerakan menghentak/mendadak (no sudden/jerking movements) yang dapat merobek serat otot/tendon akut.</w:t>
+      </w:r>
+    </w:p>
+    <w:p>
+      <w:pPr>
+        <w:pStyle w:val="ListBullet2"/>
+      </w:pPr>
+      <w:r>
+        <w:t>Minimalkan fiksasi mata — posisikan objek kerja di area pandang utama, cegah tension neck syndrome.</w:t>
+      </w:r>
+    </w:p>
+    <w:p>
+      <w:pPr>
+        <w:pStyle w:val="ListNumber"/>
+      </w:pPr>
+      <w:r>
+        <w:rPr>
+          <w:b/>
+        </w:rPr>
+        <w:t>Structured Micro-breaks</w:t>
+      </w:r>
+      <w:r>
+        <w:t xml:space="preserve">: sesuai Permenaker No. 5/2018, wajib jeda peregangan aktif </w:t>
+      </w:r>
+      <w:r>
+        <w:rPr>
+          <w:b/>
+        </w:rPr>
+        <w:t>5-10 menit setiap 1-2 jam</w:t>
+      </w:r>
+      <w:r>
+        <w:t xml:space="preserve"> kerja terus-menerus — terbukti klinis menurunkan akumulasi asam laktat &amp; tekanan intrakarpal tanpa menurunkan produktivitas.</w:t>
+      </w:r>
+    </w:p>
+    <w:p>
+      <w:r>
+        <w:rPr>
+          <w:b/>
+        </w:rPr>
+        <w:t>III. Alat Pelindung Diri (APD) — lapis pertahanan terakhir, disandingkan dengan kontrol di atasnya:</w:t>
+      </w:r>
+    </w:p>
+    <w:p>
+      <w:pPr>
+        <w:pStyle w:val="ListBullet"/>
+      </w:pPr>
+      <w:r>
+        <w:t>Sarung tangan anti-vibrasi — redam transmisi getaran mesin genggam ke pergelangan tangan.</w:t>
+      </w:r>
+    </w:p>
+    <w:p>
+      <w:pPr>
+        <w:pStyle w:val="ListBullet"/>
+      </w:pPr>
+      <w:r>
+        <w:t>OA lutut/kaki — sepatu bersol empuk shock-absorbing + sol anti-slip.</w:t>
+      </w:r>
+    </w:p>
+    <w:p>
+      <w:pPr>
+        <w:pStyle w:val="ListBullet"/>
+      </w:pPr>
+      <w:r>
+        <w:rPr>
+          <w:b/>
+        </w:rPr>
+        <w:t>Catatan medikolegal</w:t>
+      </w:r>
+      <w:r>
+        <w:t xml:space="preserve">: sabuk penyangga pinggang (back belts/lumbar support belts) </w:t>
+      </w:r>
+      <w:r>
+        <w:rPr>
+          <w:b/>
+        </w:rPr>
+        <w:t>TIDAK direkomendasikan NIOSH</w:t>
+      </w:r>
+      <w:r>
+        <w:t xml:space="preserve"> sebagai APD pencegahan LBP primer — tidak terbukti biomekanis menurunkan beban kompresi diskus lumbal.</w:t>
+      </w:r>
+    </w:p>
+    <w:p>
+      <w:r>
+        <w:rPr>
+          <w:b/>
+        </w:rPr>
+        <w:t>Lafaz OSCE "Lafaz JSA" (Rekomendasi Komunitas Terintegrasi):</w:t>
+      </w:r>
+      <w:r>
+        <w:t xml:space="preserve"> </w:t>
+      </w:r>
+      <w:r>
+        <w:rPr>
+          <w:i/>
+        </w:rPr>
+        <w:t>"Bapak/Ibu Penguji, berdasarkan analisis JSA pada stasiun kerja ini, saya merumuskan Tatalaksana Okupasi Tingkat Komunitas yang terintegrasi menggunakan Hirarki Pengendalian Risiko sesuai Permenaker No. 5 Tahun 2018. Pertama, pada tingkat Rekayasa Teknis, saya merekomendasikan redesain [stasiun kerja] — krusial untuk mengeliminasi postur janggal abduksi bahu pada SAPS dan fleksi punggung ekstrem pada LRS secara bersamaan. Kedua, pada tingkat Administratif, saya merancang program Rotasi Kerja per jam secara reguler untuk membagi beban biomekanis fokal ke stasiun kerja yang lebih bervariasi demi menekan Worker Exposure Index. Saya juga menerapkan prinsip Motion Economy dari Barnes berupa instruksi meminimalkan gerakan menghentak mendadak, mengutamakan pemakaian tangan secara bergantian, serta mewajibkan penyediaan micro-breaks terstruktur selama 10 menit setiap 2 jam yang diisi dengan peregangan dinamis berlawanan arah postur janggal kerja. Ketiga, pada tingkat APD, saya mensyaratkan penggunaan sarung tangan anti-vibrasi jika stasiun kerja terbukti memiliki paparan bahaya getaran lokal mesin di atas Nilai Ambang Batas."</w:t>
+      </w:r>
+    </w:p>
+    <w:p>
+      <w:r>
+        <w:rPr>
+          <w:b/>
+        </w:rPr>
+        <w:t>Saran Emas Examiner:</w:t>
+      </w:r>
+      <w:r>
+        <w:t xml:space="preserve"> penguji sangat menyukai jawaban yang membumi, dapat diaplikasikan langsung di industri, namun tetap ditopang rujukan regulasi hukum kuat — rinci metode Work Rotation, Work Expansion, dan Motion Economy (Barnes 1963) di level komunitas secara runut.</w:t>
+      </w:r>
+    </w:p>
+    <w:p>
+      <w:pPr>
+        <w:pStyle w:val="Heading2"/>
+      </w:pPr>
+      <w:r>
+        <w:t>2.13c Return to Work &amp; pembatasan kerja [MEMADAI]</w:t>
+      </w:r>
+    </w:p>
+    <w:p>
+      <w:r>
+        <w:rPr>
+          <w:i/>
+        </w:rPr>
+        <w:t>(Bagian ini juga dibahas terintegrasi dengan Grading Okupasi di [[muskuloskeletal_okupasi 2.9b]]; berikut ringkasan fokus programnya.)</w:t>
+      </w:r>
+    </w:p>
+    <w:p>
+      <w:r>
+        <w:t>Transisi pekerja dari status Temporary Unfit kembali ke stasiun kerjanya wajib melalui fase pemulihan jaringan fisiologis yang terukur:</w:t>
+      </w:r>
+    </w:p>
+    <w:p>
+      <w:pPr>
+        <w:pStyle w:val="ListNumber"/>
+      </w:pPr>
+      <w:r>
+        <w:rPr>
+          <w:b/>
+        </w:rPr>
+        <w:t>Fase Remodeling Jaringan (Tissue Remodeling)</w:t>
+      </w:r>
+      <w:r>
+        <w:t>: cedera jaringan lunak (tendon/otot) memerlukan pemulihan berjenjang — peningkatan beban biomekanik terlalu cepat berisiko tinggi memicu cedera berulang (re-injury) yang lebih parah.</w:t>
+      </w:r>
+    </w:p>
+    <w:p>
+      <w:pPr>
+        <w:pStyle w:val="ListNumber"/>
+      </w:pPr>
+      <w:r>
+        <w:rPr>
+          <w:b/>
+        </w:rPr>
+        <w:t>Work Hardening Program</w:t>
+      </w:r>
+      <w:r>
+        <w:t>: rancang program latihan fisik fungsional tergradasi (graduated physical training) di klinik rehabilitasi perusahaan untuk menyamakan kapasitas fisik pekerja dengan target JSA stasiun kerjanya sebelum dinyatakan laik kerja penuh.</w:t>
+      </w:r>
+    </w:p>
+    <w:p>
+      <w:pPr>
+        <w:pStyle w:val="ListNumber"/>
+      </w:pPr>
+      <w:r>
+        <w:rPr>
+          <w:b/>
+        </w:rPr>
+        <w:t>Work Scheduling (Kontrol Administratif)</w:t>
+      </w:r>
+      <w:r>
+        <w:t>: terapkan Job Rotation dan Job Enlargement secara taktis saat pekerja mulai kembali bekerja — contoh: pekerja pemulihan SAPS dipindahkan berkala tiap 2 jam dari tugas abduksi bahu minimal ke tugas perakitan ringan setinggi meja untuk mengistirahatkan bahu.</w:t>
+      </w:r>
+    </w:p>
+    <w:p>
+      <w:r>
+        <w:rPr>
+          <w:b/>
+        </w:rPr>
+        <w:t>Pembatasan kerja konkret per kondisi</w:t>
+      </w:r>
+      <w:r>
+        <w:t xml:space="preserve"> (ringkasan — detail lengkap matriks FFD di [[muskuloskeletal_okupasi 2.9b]]):</w:t>
+      </w:r>
+    </w:p>
+    <w:p>
+      <w:pPr>
+        <w:pStyle w:val="ListBullet"/>
+      </w:pPr>
+      <w:r>
+        <w:t>CTS Severe pasca-CTR: bebas penuh dari tugas manual 4-6 minggu; bila sisa kelemahan permanen → Fit with Permanent Restriction (mutasi ke posisi non-repetitif).</w:t>
+      </w:r>
+    </w:p>
+    <w:p>
+      <w:pPr>
+        <w:pStyle w:val="ListBullet"/>
+      </w:pPr>
+      <w:r>
+        <w:t>LRS/HNP Severe pasca-bedah: bebas total aktivitas fisik + rehabilitasi aktif; defisit motorik menetap &gt;6 bulan → larang manual handling selamanya, larang berdiri &gt;1 jam, larang memanjat tangga/scaffolding.</w:t>
+      </w:r>
+    </w:p>
+    <w:p>
+      <w:pPr>
+        <w:pStyle w:val="ListBullet"/>
+      </w:pPr>
+      <w:r>
+        <w:t>OA Genu/Hip Severe: alihkan dari field worker ke operator ruang kontrol duduk murni; larang jalan jauh &gt;500m berturut-turut.</w:t>
+      </w:r>
+    </w:p>
+    <w:p>
+      <w:pPr>
+        <w:pStyle w:val="ListBullet"/>
+      </w:pPr>
+      <w:r>
+        <w:t>SAPS Severe pasca-rehabilitasi: transisi bertahap dari shoulder sling ke tugas ringan.</w:t>
+      </w:r>
+    </w:p>
+    <w:p>
+      <w:r>
+        <w:rPr>
+          <w:b/>
+        </w:rPr>
+        <w:t>RTW &amp; Disability</w:t>
+      </w:r>
+      <w:r>
+        <w:t>: pantau kapasitas fungsional residual secara longitudinal tahunan menggunakan kuesioner spesifik kondisi (BCTQ/ODI/QuickDASH/WOMAC), target perbaikan melampaui batas MCID sebelum diizinkan kembali bekerja penuh ([[muskuloskeletal_okupasi 2.10b]]).</w:t>
+      </w:r>
+    </w:p>
+    <w:p>
+      <w:pPr>
         <w:pStyle w:val="Heading1"/>
       </w:pPr>
       <w:r>
@@ -10978,6 +12228,349 @@
       </w:r>
       <w:r>
         <w:t xml:space="preserve"> menyebutkan sinkronisasi Perpres 7/2019, PP 50/2012, dan Permenaker 25/2008 dalam menyusun draf keputusan kompensasi/medikolegal adalah tanda kematangan mutlak — kunci nilai sempurna.</w:t>
+      </w:r>
+    </w:p>
+    <w:p>
+      <w:pPr>
+        <w:pStyle w:val="Heading2"/>
+      </w:pPr>
+      <w:r>
+        <w:t>2.14b Kerangka kompensasi PP 44/2015 [MEMADAI]</w:t>
+      </w:r>
+    </w:p>
+    <w:p>
+      <w:r>
+        <w:t>Tugas Sp.Ok tidak berhenti pada penulisan diagnosis PAK di atas kertas — kemampuan mengawal hak-hak konstitusional pekerja memperoleh kompensasi finansial dan rehabilitasi medis adalah parameter utama kematangan profesional.</w:t>
+      </w:r>
+    </w:p>
+    <w:p>
+      <w:r>
+        <w:rPr>
+          <w:b/>
+        </w:rPr>
+        <w:t>I. Hubungan Struktural Regulasi:</w:t>
+      </w:r>
+    </w:p>
+    <w:p>
+      <w:pPr>
+        <w:pStyle w:val="ListBullet"/>
+      </w:pPr>
+      <w:r>
+        <w:rPr>
+          <w:b/>
+        </w:rPr>
+        <w:t>PP No. 44 Tahun 2015</w:t>
+      </w:r>
+      <w:r>
+        <w:t xml:space="preserve"> bertindak sebagai regulasi induk yang menetapkan bahwa pekerja PAK berhak atas manfaat JKK.</w:t>
+      </w:r>
+    </w:p>
+    <w:p>
+      <w:pPr>
+        <w:pStyle w:val="ListBullet"/>
+      </w:pPr>
+      <w:r>
+        <w:rPr>
+          <w:b/>
+        </w:rPr>
+        <w:t>Perpres No. 7 Tahun 2019</w:t>
+      </w:r>
+      <w:r>
+        <w:t xml:space="preserve"> diundangkan khusus melaksanakan amanat Pasal 48 ayat (3) PP No. 44/2015 guna merinci daftar resmi jenis penyakit yang sah diklasifikasikan PAK (termasuk CTS, LRS/HNP, OA akibat kerja).</w:t>
+      </w:r>
+    </w:p>
+    <w:p>
+      <w:pPr>
+        <w:pStyle w:val="ListBullet"/>
+      </w:pPr>
+      <w:r>
+        <w:rPr>
+          <w:b/>
+        </w:rPr>
+        <w:t>PP No. 82 Tahun 2019</w:t>
+      </w:r>
+      <w:r>
+        <w:t xml:space="preserve"> adalah amandemen resmi atas PP No. 44/2015 yang meningkatkan signifikan nominal santunan finansial, beasiswa anak, dan durasi STMB tanpa menaikkan nilai iuran perusahaan.</w:t>
+      </w:r>
+    </w:p>
+    <w:p>
+      <w:r>
+        <w:rPr>
+          <w:b/>
+        </w:rPr>
+        <w:t>II. Kerangka Kompensasi (JKK BPJS Ketenagakerjaan):</w:t>
+      </w:r>
+    </w:p>
+    <w:p>
+      <w:pPr>
+        <w:pStyle w:val="ListNumber"/>
+      </w:pPr>
+      <w:r>
+        <w:rPr>
+          <w:b/>
+        </w:rPr>
+        <w:t>Unlimited Medical Benefit</w:t>
+      </w:r>
+      <w:r>
+        <w:t>: pekerja PAK MSK berhak pelayanan medis di PLKK (kerja sama BPJS Ketenagakerjaan) tanpa batasan plafon biaya sepanjang sesuai medical necessity — mencakup investigasi diagnostik penuh (NCS/EMG, USG, rontgen, MRI) dan intervensi terapeutik penuh (CTR untuk CTS berat, discectomy/laminectomy untuk LRS, TKR untuk OA genu berat, obat, implant, rehabilitasi/fisioterapi intensif).</w:t>
+      </w:r>
+    </w:p>
+    <w:p>
+      <w:pPr>
+        <w:pStyle w:val="ListNumber"/>
+      </w:pPr>
+      <w:r>
+        <w:rPr>
+          <w:b/>
+        </w:rPr>
+        <w:t>Santunan Sementara Tidak Mampu Bekerja (STMB)</w:t>
+      </w:r>
+      <w:r>
+        <w:t xml:space="preserve">: selama fase pemulihan/pasca-operasi/RTW hingga tidak dapat bekerja — </w:t>
+      </w:r>
+      <w:r>
+        <w:rPr>
+          <w:b/>
+        </w:rPr>
+        <w:t>100% upah 12 bulan pertama</w:t>
+      </w:r>
+      <w:r>
+        <w:t xml:space="preserve">, lalu </w:t>
+      </w:r>
+      <w:r>
+        <w:rPr>
+          <w:b/>
+        </w:rPr>
+        <w:t>50% upah</w:t>
+      </w:r>
+      <w:r>
+        <w:t xml:space="preserve"> hingga sembuh/cacat permanen/meninggal.</w:t>
+      </w:r>
+    </w:p>
+    <w:p>
+      <w:pPr>
+        <w:pStyle w:val="ListNumber"/>
+      </w:pPr>
+      <w:r>
+        <w:rPr>
+          <w:b/>
+        </w:rPr>
+        <w:t>Santunan Cacat Fungsi &amp; Anatomis</w:t>
+      </w:r>
+      <w:r>
+        <w:t xml:space="preserve">: setelah Maximum Medical Improvement, bila menyisakan disabilitas/kehilangan fungsi menetap, dihitung berdasarkan </w:t>
+      </w:r>
+      <w:r>
+        <w:rPr>
+          <w:b/>
+        </w:rPr>
+        <w:t>Permenaker No. 25 Tahun 2008</w:t>
+      </w:r>
+      <w:r>
+        <w:t>:</w:t>
+      </w:r>
+    </w:p>
+    <w:p>
+      <w:pPr>
+        <w:pStyle w:val="ListBullet2"/>
+      </w:pPr>
+      <w:r>
+        <w:t>Cacat Sebagian Anatomis: % Tabel × 80 × Upah Sebulan.</w:t>
+      </w:r>
+    </w:p>
+    <w:p>
+      <w:pPr>
+        <w:pStyle w:val="ListBullet2"/>
+      </w:pPr>
+      <w:r>
+        <w:t>Cacat Sebagian Fungsi: % Penurunan Fungsi (dinilai objektif Sp.Ok via goniometer/AMA Guides — lihat [[muskuloskeletal_okupasi 2.14c]]) × % Tabel × 80 × Upah Sebulan.</w:t>
+      </w:r>
+    </w:p>
+    <w:p>
+      <w:pPr>
+        <w:pStyle w:val="ListBullet2"/>
+      </w:pPr>
+      <w:r>
+        <w:t>Cacat Total Tetap: 70% × 80 × Upah Sebulan + Santunan Berkala (dibayar sekaligus Rp 12.000.000 berdasarkan PP 82/2019).</w:t>
+      </w:r>
+    </w:p>
+    <w:p>
+      <w:pPr>
+        <w:pStyle w:val="ListNumber"/>
+      </w:pPr>
+      <w:r>
+        <w:rPr>
+          <w:b/>
+        </w:rPr>
+        <w:t>Santunan Kematian akibat PAK</w:t>
+      </w:r>
+      <w:r>
+        <w:t xml:space="preserve">: termasuk beasiswa pendidikan anak — maksimal 2 anak dari TK hingga Perguruan Tinggi, nilai total maksimal </w:t>
+      </w:r>
+      <w:r>
+        <w:rPr>
+          <w:b/>
+        </w:rPr>
+        <w:t>Rp 174.000.000</w:t>
+      </w:r>
+      <w:r>
+        <w:t xml:space="preserve"> (PP 82/2019).</w:t>
+      </w:r>
+    </w:p>
+    <w:p>
+      <w:r>
+        <w:rPr>
+          <w:b/>
+        </w:rPr>
+        <w:t>III. Alur Prosedur Klaim PAK Terstandar:</w:t>
+      </w:r>
+    </w:p>
+    <w:p>
+      <w:r>
+        <w:t xml:space="preserve">Pengobatan Medis &amp; Rehabilitasi PLKK → </w:t>
+      </w:r>
+      <w:r>
+        <w:rPr>
+          <w:b/>
+        </w:rPr>
+        <w:t>Tahap 1</w:t>
+      </w:r>
+      <w:r>
+        <w:t xml:space="preserve">: Diagnosis PAK Definitif oleh Sp.Ok — terbitkan Surat Keterangan Dokter PAK (sesuai Perpres 7/2019) → </w:t>
+      </w:r>
+      <w:r>
+        <w:rPr>
+          <w:b/>
+        </w:rPr>
+        <w:t>Tahap 2</w:t>
+      </w:r>
+      <w:r>
+        <w:t xml:space="preserve">: Pelaporan Tahap I (Form F1a-KK) — pemberi kerja lapor ke BPJS Ketenagakerjaan &amp; Disnaker dalam </w:t>
+      </w:r>
+      <w:r>
+        <w:rPr>
+          <w:b/>
+        </w:rPr>
+        <w:t>2×24 jam</w:t>
+      </w:r>
+      <w:r>
+        <w:t xml:space="preserve"> sejak didiagnosis PAK → </w:t>
+      </w:r>
+      <w:r>
+        <w:rPr>
+          <w:b/>
+        </w:rPr>
+        <w:t>Tahap 3</w:t>
+      </w:r>
+      <w:r>
+        <w:t>: Pelaporan Tahap II (pasca-perawatan selesai, termasuk Form F3b-KK penilaian kecacatan) → Verifikasi &amp; Pencairan Manfaat oleh BPJS TK.</w:t>
+      </w:r>
+    </w:p>
+    <w:p>
+      <w:r>
+        <w:rPr>
+          <w:b/>
+        </w:rPr>
+        <w:t>Perlindungan Pasca-Kerja</w:t>
+      </w:r>
+      <w:r>
+        <w:t xml:space="preserve">: merujuk Pasal 2 Perpres No. 7/2019 (mengadopsi prinsip PP 44/2015), pekerja PAK tetap berhak penuh manfaat JKK meski hubungan kerja telah berakhir/resign/pensiun, dengan syarat gejala PAK timbul dalam </w:t>
+      </w:r>
+      <w:r>
+        <w:rPr>
+          <w:b/>
+        </w:rPr>
+        <w:t>paling lama 3 tahun</w:t>
+      </w:r>
+      <w:r>
+        <w:t xml:space="preserve"> sejak hubungan kerja berakhir.</w:t>
+      </w:r>
+    </w:p>
+    <w:p>
+      <w:r>
+        <w:rPr>
+          <w:b/>
+        </w:rPr>
+        <w:t>IV. Distribusi Tanggung Jawab &amp; Sanksi Medikolegal:</w:t>
+      </w:r>
+    </w:p>
+    <w:p>
+      <w:pPr>
+        <w:pStyle w:val="ListBullet"/>
+      </w:pPr>
+      <w:r>
+        <w:rPr>
+          <w:b/>
+        </w:rPr>
+        <w:t>Pemberi Kerja/Pengusaha</w:t>
+      </w:r>
+      <w:r>
+        <w:t xml:space="preserve">: wajib mendaftarkan seluruh pekerja BPJS Ketenagakerjaan, bayar iuran tertib, catat &amp; lapor kasus PAK. </w:t>
+      </w:r>
+      <w:r>
+        <w:rPr>
+          <w:b/>
+        </w:rPr>
+        <w:t>Sanksi kelalaian (Pasal 55 PP 44/2015)</w:t>
+      </w:r>
+      <w:r>
+        <w:t>: bila perusahaan lalai mendaftarkan/terlambat melapor hingga klaim ditolak, perusahaan wajib menanggung sendiri seluruh biaya kompensasi yang seharusnya ditanggung BPJS.</w:t>
+      </w:r>
+    </w:p>
+    <w:p>
+      <w:pPr>
+        <w:pStyle w:val="ListBullet"/>
+      </w:pPr>
+      <w:r>
+        <w:rPr>
+          <w:b/>
+        </w:rPr>
+        <w:t>BPJS Ketenagakerjaan</w:t>
+      </w:r>
+      <w:r>
+        <w:t>: bertanggung jawab penuh membayar biaya pelayanan medis langsung ke PLKK (cashless) dan mentransfer santunan tunai (STMB, cacat, kematian) ke rekening pekerja/ahli waris setelah verifikasi dokumen lengkap.</w:t>
+      </w:r>
+    </w:p>
+    <w:p>
+      <w:pPr>
+        <w:pStyle w:val="ListBullet"/>
+      </w:pPr>
+      <w:r>
+        <w:rPr>
+          <w:b/>
+        </w:rPr>
+        <w:t>Pengawas Ketenagakerjaan &amp; Dokter Penasihat (Disnaker)</w:t>
+      </w:r>
+      <w:r>
+        <w:t>: berwenang mengawasi kepatuhan K3, verifikasi lapangan, bertindak sebagai mediator medikolegal bila terjadi sengketa penetapan kausalitas PAK atau perbedaan perhitungan persentase kecacatan antara Sp.Ok RS dengan BPJS Ketenagakerjaan.</w:t>
+      </w:r>
+    </w:p>
+    <w:p>
+      <w:r>
+        <w:rPr>
+          <w:b/>
+        </w:rPr>
+        <w:t>Lafaz OSCE (Klaim Kompensasi CTS):</w:t>
+      </w:r>
+      <w:r>
+        <w:t xml:space="preserve"> </w:t>
+      </w:r>
+      <w:r>
+        <w:rPr>
+          <w:i/>
+        </w:rPr>
+        <w:t>"Bapak/Ibu Penguji, setelah diagnosis CTS Dextra sebagai Penyakit Akibat Kerja (PAK) pada pasien ini tegak secara sah berdasarkan kriteria Perpres No. 7 Tahun 2019 Lampiran II.c.7, langkah medikolegal berikutnya adalah memastikan pemberi kerja segera melaporkannya menggunakan Formulir Laporan Tahap I (Form F1a-KK) ke BPJS Ketenagakerjaan dalam waktu maksimal 2×24 jam. Selama pasien menjalani operasi dekompresi terencana dan fase pemulihan pasca-bedah, seluruh biaya medis di fasilitas PLKK akan ditanggung secara penuh tanpa batasan plafon oleh BPJS Ketenagakerjaan, dan pasien berhak menerima santunan STMB sebesar 100% upah guna menjamin ketahanan ekonominya. Setelah pengobatan dinyatakan maksimal, saya selaku Sp.Ok yang merawat akan melakukan penilaian kecacatan fungsional menetap menggunakan instrumen uji fungsional, lalu menuangkannya dalam Form F3b-KK (Surat Keterangan Dokter Cacat) agar pasien mendapatkan santunan cacat fungsi berdasarkan formula perhitungan Permenaker No. 25 Tahun 2008."</w:t>
+      </w:r>
+    </w:p>
+    <w:p>
+      <w:r>
+        <w:rPr>
+          <w:b/>
+        </w:rPr>
+        <w:t>Saran Emas Examiner:</w:t>
+      </w:r>
+      <w:r>
+        <w:t xml:space="preserve"> kandidat yang mampu memaparkan sinkronisasi dinamis antara PP 44/2015 (induk), Perpres 7/2019 (pintu masuk diagnosis PAK), dan PP 82/2019 (peningkatan manfaat) menunjukkan kompetensi medikolegal industri skala besar.</w:t>
       </w:r>
     </w:p>
     <w:p>

</xml_diff>